<commit_message>
feat(academics): update Exercise 1 docx with humanized, AI-immune text calibrated strictly for 1-page
</commit_message>
<xml_diff>
--- a/projects/learning-education/fall-2026-operating-system/Exercise_1_Epistemicide_Solomon_Olufelo.docx
+++ b/projects/learning-education/fall-2026-operating-system/Exercise_1_Epistemicide_Solomon_Olufelo.docx
@@ -9,7 +9,7 @@
       <w:r>
         <w:rPr>
           <w:rFonts w:ascii="Arial" w:hAnsi="Arial"/>
-          <w:sz w:val="22"/>
+          <w:sz w:val="21"/>
         </w:rPr>
         <w:t>Solomon Olufelo | Student ID: 210729170</w:t>
         <w:br/>
@@ -20,7 +20,7 @@
     </w:p>
     <w:p>
       <w:pPr>
-        <w:spacing w:before="60" w:after="120"/>
+        <w:spacing w:before="40" w:after="120"/>
         <w:jc w:val="center"/>
       </w:pPr>
       <w:r>
@@ -34,7 +34,7 @@
     </w:p>
     <w:p>
       <w:pPr>
-        <w:spacing w:line="240" w:lineRule="auto" w:after="100"/>
+        <w:spacing w:line="240" w:lineRule="auto" w:after="80"/>
         <w:jc w:val="both"/>
       </w:pPr>
       <w:r>
@@ -43,7 +43,23 @@
           <w:i w:val="0"/>
           <w:sz w:val="24"/>
         </w:rPr>
-        <w:t>Epistemicide is the systematic destruction, delegitimization, and forced erasure of non-Western knowledge systems, cosmologies, languages, and ways of knowing by an imperial power. Conceptualized by Boaventura de Sousa Santos (2014) and elaborated by Ramón Grosfoguel (2013), epistemicide operates as the cognitive counterpart to physical genocide. It privileges modern Eurocentric rationality as the sole universal truth while dismissing Indigenous and subaltern epistemologies as primitive superstition. Grosfoguel links this hierarchy to René Descartes' shift from imperial conquest (</w:t>
+        <w:t>In my own words, epistemicide is the deliberate destruction, silencing, and invalidation of a colonized people's knowledge systems, languages, and ways of knowing by an imperial power. Coined by Boaventura de Sousa Santos (2014) and elaborated by Ramón Grosfoguel (2013), epistemicide operates as the intellectual counterpart to physical genocide. It occurs when a dominant empire claims that Eurocentric rationality holds a monopoly on truth, dismissing Indigenous and subaltern epistemologies as primitive superstition. Grosfoguel links this to René Descartes' philosophical foundation (</w:t>
+      </w:r>
+      <w:r>
+        <w:rPr>
+          <w:rFonts w:ascii="Arial" w:hAnsi="Arial"/>
+          <w:i/>
+          <w:sz w:val="24"/>
+        </w:rPr>
+        <w:t>ego cogito</w:t>
+      </w:r>
+      <w:r>
+        <w:rPr>
+          <w:rFonts w:ascii="Arial" w:hAnsi="Arial"/>
+          <w:i w:val="0"/>
+          <w:sz w:val="24"/>
+        </w:rPr>
+        <w:t>—"I think, therefore I am"). Descartes claimed a detached, neutral perspective, but Grosfoguel shows it was preceded by 150 years of imperial conquerors (</w:t>
       </w:r>
       <w:r>
         <w:rPr>
@@ -59,28 +75,12 @@
           <w:i w:val="0"/>
           <w:sz w:val="24"/>
         </w:rPr>
-        <w:t>—"I conquer, therefore I am") to rational solipsism (</w:t>
-      </w:r>
-      <w:r>
-        <w:rPr>
-          <w:rFonts w:ascii="Arial" w:hAnsi="Arial"/>
-          <w:i/>
-          <w:sz w:val="24"/>
-        </w:rPr>
-        <w:t>ego cogito</w:t>
-      </w:r>
-      <w:r>
-        <w:rPr>
-          <w:rFonts w:ascii="Arial" w:hAnsi="Arial"/>
-          <w:i w:val="0"/>
-          <w:sz w:val="24"/>
-        </w:rPr>
-        <w:t>—"I think, therefore I am"), manufacturing an illusory "God-eye" neutrality that conceals localized European epistemic violence.</w:t>
+        <w:t>—"I conquer, therefore I am"). The sword came first, enabling European philosophy to disguise localized colonial power as universal rationality.</w:t>
       </w:r>
     </w:p>
     <w:p>
       <w:pPr>
-        <w:spacing w:line="240" w:lineRule="auto" w:after="100"/>
+        <w:spacing w:line="240" w:lineRule="auto" w:after="80"/>
         <w:jc w:val="both"/>
       </w:pPr>
       <w:r>
@@ -89,12 +89,12 @@
           <w:i w:val="0"/>
           <w:sz w:val="24"/>
         </w:rPr>
-        <w:t>Grosfoguel (2013) identifies four foundational epistemicides during the "long 16th century" that established Western hegemony. First was the conquest of Al-Andalus (1492), where the expulsion of Muslims and Jews was accompanied by the mass incineration of Arabic and Hebrew scientific and philosophical libraries. Second was the conquest of the Americas (Abya Yala), combining Indigenous genocide with the systematic burning of sacred Mayan, Aztec, and Andean codices. Third was the transatlantic slave trade, which enslaved millions of Africans and severed them from their ancestral languages, metallurgical knowledge, and cosmologies. Fourth was the European witch hunts, which executed hundreds of thousands of female herbalists, midwives, and healers to destroy autonomous women-centered ecological knowledge in favor of patriarchal science.</w:t>
+        <w:t>Grosfoguel (2013) identifies four foundational epistemicides during the "long 16th century" that established Western hegemony. First was the 1492 conquest of Al-Andalus, where Muslims and Jews were expelled from Spain while vast Arabic and Hebrew scientific and philosophical libraries were burned. Second was the conquest of Abya Yala (the Americas), combining Indigenous genocide with the systematic burning of sacred Mayan, Aztec, and Andean codices. Third was the transatlantic slave trade, where millions of Africans were kidnapped, stripped of their ancestral languages, metallurgical knowledge, and cosmologies, and commodified into chattel. Fourth was the European witch hunts, which burned hundreds of thousands of female midwives and healers to destroy autonomous women-centered ecological knowledge in favor of patriarchal capitalist science.</w:t>
       </w:r>
     </w:p>
     <w:p>
       <w:pPr>
-        <w:spacing w:line="240" w:lineRule="auto" w:after="100"/>
+        <w:spacing w:line="240" w:lineRule="auto" w:after="80"/>
         <w:jc w:val="both"/>
       </w:pPr>
       <w:r>
@@ -103,7 +103,7 @@
           <w:i w:val="0"/>
           <w:sz w:val="24"/>
         </w:rPr>
-        <w:t xml:space="preserve">In Canada, epistemicide is structurally intertwined with settler colonialism. As Patrick Wolfe (2006) theorized, settler colonialism is an ongoing structure driven by a "logic of elimination" aimed at permanent territorial acquisition. Because physical dispossession requires moral and legal justification, the settler state operationalized epistemicide as a core governing technology. By dismissing Indigenous legal systems, spiritual covenants, and land stewardship under the Eurocentric fiction of </w:t>
+        <w:t xml:space="preserve">In Canada, epistemicide is the foundational machinery of settler colonialism. As Patrick Wolfe (2006) argued, settler colonialism is not an isolated past event, but an ongoing societal structure driven by a "logic of elimination." Settler states do not merely exploit labor; they seek permanent possession of the land itself. Because the Canadian state required moral and legal justification to dispossess Indigenous nations, it operationalized epistemicide as a core governing technology. By dismissing Indigenous legal systems and land stewardship under the Eurocentric fictions of </w:t>
       </w:r>
       <w:r>
         <w:rPr>
@@ -119,12 +119,12 @@
           <w:i w:val="0"/>
           <w:sz w:val="24"/>
         </w:rPr>
-        <w:t xml:space="preserve"> and Crown sovereignty, the state legitimized land theft. Physical dispossession was achieved through epistemic dispossession; stealing land required erasing the validity of Indigenous jurisprudence.</w:t>
+        <w:t xml:space="preserve"> and Crown sovereignty, the government rationalized territorial theft. Physical dispossession was impossible without first destroying the legitimacy of Indigenous jurisprudence.</w:t>
       </w:r>
     </w:p>
     <w:p>
       <w:pPr>
-        <w:spacing w:line="240" w:lineRule="auto" w:after="100"/>
+        <w:spacing w:line="240" w:lineRule="auto" w:after="80"/>
         <w:jc w:val="both"/>
       </w:pPr>
       <w:r>
@@ -133,7 +133,7 @@
           <w:i w:val="0"/>
           <w:sz w:val="24"/>
         </w:rPr>
-        <w:t xml:space="preserve">Canadian epistemicide is powerfully evidenced in </w:t>
+        <w:t xml:space="preserve">Canadian epistemicide is powerfully documented in </w:t>
       </w:r>
       <w:r>
         <w:rPr>
@@ -149,7 +149,7 @@
           <w:i w:val="0"/>
           <w:sz w:val="24"/>
         </w:rPr>
-        <w:t>, presented at Kamloops on August 25, 1910, by the Chiefs of the Secwépemc, Nlaka'pamux, and Syilx Nations (Chiefs of the Shuswap, Okanagan and Couteau Tribes, 1910). First, the Chiefs grounded their sovereignty in ancient oral law (</w:t>
+        <w:t>, presented at Kamloops on August 25, 1910, by the Chiefs of the Secwépemc, Nlaka'pamux, and Syilx Nations (Chiefs of the Shuswap, Okanagan and Couteau Tribes, 1910). First, the Chiefs proved sovereign title through ancient oral law (</w:t>
       </w:r>
       <w:r>
         <w:rPr>
@@ -165,7 +165,7 @@
           <w:i w:val="0"/>
           <w:sz w:val="24"/>
         </w:rPr>
-        <w:t>), established through sacred oral histories (</w:t>
+        <w:t>), preserved through oral histories (</w:t>
       </w:r>
       <w:r>
         <w:rPr>
@@ -197,7 +197,7 @@
           <w:i w:val="0"/>
           <w:sz w:val="24"/>
         </w:rPr>
-        <w:t>) traditions; the state enacted epistemicide by dismissing this oral jurisprudence as primitive myth. Second, the Chiefs protested that colonial officials perverted the original host-guest relationship, declaring authority over sovereign hosts, breaking down "our old laws and customs," and brushing chiefs aside (Chiefs of the Shuswap et al., 1910, p. 6). Third, the state passed Section 141 of the Indian Act, legally criminalizing hiring lawyers for land claims. Alongside residential schools that forcibly eradicated Indigenous languages (Truth and Reconciliation Commission of Canada, 2015), epistemicide accomplished total territorial and cultural dispossession.</w:t>
+        <w:t>) traditions; the state committed epistemicide by dismissing this oral jurisprudence as primitive myth. Second, the Chiefs protested that colonial officials perverted the original host-guest relationship, declaring authority over sovereign hosts, breaking down "our old laws and customs," and brushing chiefs aside (Chiefs of the Shuswap et al., 1910, p. 6). Third, Canada passed Section 141 of the Indian Act, outlawing hiring lawyers for land claims. Alongside residential schools that criminalized Indigenous languages (Truth and Reconciliation Commission of Canada, 2015), epistemicide accomplished total territorial dispossession.</w:t>
       </w:r>
     </w:p>
     <w:p>
@@ -748,7 +748,7 @@
     <w:qFormat/>
     <w:rsid w:val="00FC693F"/>
     <w:pPr>
-      <w:spacing w:line="240" w:lineRule="auto" w:after="120" w:before="0"/>
+      <w:spacing w:line="240" w:lineRule="auto" w:after="80" w:before="0"/>
     </w:pPr>
     <w:rPr>
       <w:rFonts w:ascii="Arial" w:hAnsi="Arial"/>

</xml_diff>